<commit_message>
explanation style changed,final version
</commit_message>
<xml_diff>
--- a/Assignment2.docx
+++ b/Assignment2.docx
@@ -299,49 +299,47 @@
       </w:pPr>
       <w:r>
         <w:rPr>
-          <w:i/>
+          <w:b/>
+          <w:bCs/>
+        </w:rPr>
+        <w:t xml:space="preserve">airquality_dataset</w:t>
+      </w:r>
+      <w:r>
+        <w:t xml:space="preserve"> </w:t>
+      </w:r>
+      <w:r>
+        <w:t xml:space="preserve">is used to complete assignment.</w:t>
+      </w:r>
+      <w:r>
+        <w:t xml:space="preserve"> </w:t>
+      </w:r>
+      <w:r>
+        <w:t xml:space="preserve">Using</w:t>
+      </w:r>
+      <w:r>
+        <w:t xml:space="preserve"> </w:t>
+      </w:r>
+      <w:r>
+        <w:rPr>
           <w:i/>
           <w:iCs/>
-          <w:iCs/>
-        </w:rPr>
-        <w:t xml:space="preserve">airquality</w:t>
+        </w:rPr>
+        <w:t xml:space="preserve">complete_cases</w:t>
       </w:r>
       <w:r>
         <w:t xml:space="preserve"> </w:t>
       </w:r>
       <w:r>
-        <w:t xml:space="preserve">dataset is used to complete assignment.</w:t>
+        <w:t xml:space="preserve">complete rows were identified and cleaned new dataset</w:t>
       </w:r>
       <w:r>
         <w:t xml:space="preserve"> </w:t>
       </w:r>
       <w:r>
-        <w:t xml:space="preserve">Using</w:t>
-      </w:r>
-      <w:r>
-        <w:t xml:space="preserve"> </w:t>
-      </w:r>
-      <w:r>
-        <w:rPr>
+        <w:rPr>
+          <w:b/>
+          <w:bCs/>
           <w:i/>
-          <w:iCs/>
-        </w:rPr>
-        <w:t xml:space="preserve">complete_cases</w:t>
-      </w:r>
-      <w:r>
-        <w:t xml:space="preserve"> </w:t>
-      </w:r>
-      <w:r>
-        <w:t xml:space="preserve">complete rows were identified and cleaned new dataset</w:t>
-      </w:r>
-      <w:r>
-        <w:t xml:space="preserve"> </w:t>
-      </w:r>
-      <w:r>
-        <w:rPr>
-          <w:i/>
-          <w:i/>
-          <w:iCs/>
           <w:iCs/>
         </w:rPr>
         <w:t xml:space="preserve">airquality_cleaned</w:t>

</xml_diff>